<commit_message>
Edits on docx files
</commit_message>
<xml_diff>
--- a/docs/Вступительное-слово.docx
+++ b/docs/Вступительное-слово.docx
@@ -1039,17 +1039,21 @@
           <w:bottom w:val="single" w:sz="6" w:space="1" w:color="auto"/>
         </w:pBdr>
         <w:spacing w:after="0" w:line="240" w:lineRule="auto"/>
+        <w:rPr>
+          <w:lang w:val="ru-RU"/>
+        </w:rPr>
       </w:pPr>
       <w:r>
         <w:rPr>
           <w:noProof/>
+          <w:lang w:val="ru-RU"/>
         </w:rPr>
         <w:lastRenderedPageBreak/>
         <w:drawing>
-          <wp:inline distT="0" distB="0" distL="0" distR="0" wp14:anchorId="77AD7DA3" wp14:editId="4C795DA6">
-            <wp:extent cx="5944235" cy="4938395"/>
-            <wp:effectExtent l="0" t="0" r="0" b="0"/>
-            <wp:docPr id="1429434450" name="Picture 1"/>
+          <wp:inline distT="0" distB="0" distL="0" distR="0" wp14:anchorId="2E20C85E" wp14:editId="22D157A1">
+            <wp:extent cx="5920740" cy="4880433"/>
+            <wp:effectExtent l="0" t="0" r="3810" b="0"/>
+            <wp:docPr id="1719338827" name="Picture 1"/>
             <wp:cNvGraphicFramePr>
               <a:graphicFrameLocks xmlns:a="http://schemas.openxmlformats.org/drawingml/2006/main" noChangeAspect="1"/>
             </wp:cNvGraphicFramePr>
@@ -1078,7 +1082,7 @@
                   <pic:spPr bwMode="auto">
                     <a:xfrm>
                       <a:off x="0" y="0"/>
-                      <a:ext cx="5944235" cy="4938395"/>
+                      <a:ext cx="5946450" cy="4901626"/>
                     </a:xfrm>
                     <a:prstGeom prst="rect">
                       <a:avLst/>
@@ -1098,6 +1102,9 @@
           <w:bottom w:val="single" w:sz="6" w:space="1" w:color="auto"/>
         </w:pBdr>
         <w:spacing w:after="0" w:line="240" w:lineRule="auto"/>
+        <w:rPr>
+          <w:lang w:val="ru-RU"/>
+        </w:rPr>
       </w:pPr>
     </w:p>
     <w:p>
@@ -1106,6 +1113,9 @@
           <w:bottom w:val="single" w:sz="6" w:space="1" w:color="auto"/>
         </w:pBdr>
         <w:spacing w:after="0" w:line="240" w:lineRule="auto"/>
+        <w:rPr>
+          <w:lang w:val="ru-RU"/>
+        </w:rPr>
       </w:pPr>
     </w:p>
     <w:p>
@@ -1116,6 +1126,7 @@
           <w:iCs/>
           <w:sz w:val="22"/>
           <w:szCs w:val="22"/>
+          <w:lang w:val="ru-RU"/>
         </w:rPr>
       </w:pPr>
     </w:p>

</xml_diff>

<commit_message>
Didn't capture JUL lists in previous commits
</commit_message>
<xml_diff>
--- a/docs/Вступительное-слово.docx
+++ b/docs/Вступительное-слово.docx
@@ -738,7 +738,13 @@
         <w:rPr>
           <w:lang w:val="ru-RU"/>
         </w:rPr>
-        <w:t xml:space="preserve">, если в настоящем живут люди, берущие на себя </w:t>
+        <w:t>, если в настоящем живут люди, берущие на себя</w:t>
+      </w:r>
+      <w:r>
+        <w:rPr>
+          <w:lang w:val="ru-RU"/>
+        </w:rPr>
+        <w:t xml:space="preserve"> </w:t>
       </w:r>
       <w:r>
         <w:rPr>
@@ -912,7 +918,20 @@
         <w:rPr>
           <w:lang w:val="ru-RU"/>
         </w:rPr>
-        <w:t>При составлении списков расстрелянных женщин использовались, в частности, изданные в России Обществом «Мемориал» мартирологи расстрелянных, расстрельные списки мест массовых захоронений, республиканские и региональные Книги памяти жертв репрессий.</w:t>
+        <w:t xml:space="preserve">При составлении списков расстрелянных женщин использовались, в частности, </w:t>
+      </w:r>
+      <w:r>
+        <w:rPr>
+          <w:highlight w:val="yellow"/>
+          <w:lang w:val="ru-RU"/>
+        </w:rPr>
+        <w:t>изданные в России Обществом «Мемориал»</w:t>
+      </w:r>
+      <w:r>
+        <w:rPr>
+          <w:lang w:val="ru-RU"/>
+        </w:rPr>
+        <w:t xml:space="preserve"> мартирологи расстрелянных, расстрельные списки мест массовых захоронений, республиканские и региональные Книги памяти жертв репрессий.</w:t>
       </w:r>
       <w:r>
         <w:t> </w:t>
@@ -947,6 +966,1749 @@
           <w:lang w:val="ru-RU"/>
         </w:rPr>
       </w:pPr>
+    </w:p>
+    <w:p>
+      <w:pPr>
+        <w:spacing w:after="0" w:line="240" w:lineRule="auto"/>
+        <w:rPr>
+          <w:b/>
+          <w:bCs/>
+          <w:lang w:val="ru-RU"/>
+        </w:rPr>
+      </w:pPr>
+      <w:r>
+        <w:rPr>
+          <w:b/>
+          <w:bCs/>
+          <w:lang w:val="ru-RU"/>
+        </w:rPr>
+        <w:t>ССЫЛКИ НА ОСНОВНЫЕ ИСТОЧНИКИ</w:t>
+      </w:r>
+    </w:p>
+    <w:p>
+      <w:pPr>
+        <w:spacing w:after="0"/>
+        <w:rPr>
+          <w:rFonts w:ascii="Arial" w:hAnsi="Arial" w:cs="Arial"/>
+          <w:sz w:val="18"/>
+          <w:szCs w:val="18"/>
+          <w:lang w:val="ru-RU"/>
+        </w:rPr>
+      </w:pPr>
+    </w:p>
+    <w:p>
+      <w:pPr>
+        <w:spacing w:after="0"/>
+        <w:rPr>
+          <w:rFonts w:ascii="Arial" w:hAnsi="Arial" w:cs="Arial"/>
+          <w:sz w:val="18"/>
+          <w:szCs w:val="18"/>
+          <w:lang w:val="ru-RU"/>
+        </w:rPr>
+      </w:pPr>
+      <w:hyperlink r:id="rId4" w:history="1">
+        <w:r>
+          <w:rPr>
+            <w:rStyle w:val="Hyperlink"/>
+            <w:rFonts w:ascii="Arial" w:hAnsi="Arial" w:cs="Arial"/>
+            <w:b/>
+            <w:bCs/>
+            <w:color w:val="auto"/>
+            <w:sz w:val="18"/>
+            <w:szCs w:val="18"/>
+            <w:highlight w:val="yellow"/>
+            <w:lang w:val="ru-RU"/>
+          </w:rPr>
+          <w:t>Архив Александра Яковлева</w:t>
+        </w:r>
+      </w:hyperlink>
+    </w:p>
+    <w:p>
+      <w:pPr>
+        <w:spacing w:after="0"/>
+        <w:rPr>
+          <w:rFonts w:ascii="Arial" w:eastAsia="Times New Roman" w:hAnsi="Arial" w:cs="Arial"/>
+          <w:b/>
+          <w:bCs/>
+          <w:kern w:val="0"/>
+          <w:sz w:val="18"/>
+          <w:szCs w:val="18"/>
+          <w:lang w:val="ru-RU"/>
+        </w:rPr>
+      </w:pPr>
+      <w:hyperlink r:id="rId5" w:history="1">
+        <w:r>
+          <w:rPr>
+            <w:rStyle w:val="Hyperlink"/>
+            <w:rFonts w:ascii="Arial" w:hAnsi="Arial" w:cs="Arial"/>
+            <w:b/>
+            <w:bCs/>
+            <w:color w:val="auto"/>
+            <w:sz w:val="18"/>
+            <w:szCs w:val="18"/>
+            <w:lang w:val="ru-RU"/>
+          </w:rPr>
+          <w:t>Архив Алексея Келера</w:t>
+        </w:r>
+      </w:hyperlink>
+    </w:p>
+    <w:p>
+      <w:pPr>
+        <w:spacing w:after="0"/>
+        <w:rPr>
+          <w:rFonts w:ascii="Arial" w:eastAsia="Times New Roman" w:hAnsi="Arial" w:cs="Arial"/>
+          <w:b/>
+          <w:bCs/>
+          <w:kern w:val="0"/>
+          <w:sz w:val="18"/>
+          <w:szCs w:val="18"/>
+          <w:lang w:val="ru-RU"/>
+        </w:rPr>
+      </w:pPr>
+      <w:hyperlink r:id="rId6" w:history="1">
+        <w:r>
+          <w:rPr>
+            <w:rStyle w:val="Hyperlink"/>
+            <w:rFonts w:ascii="Arial" w:hAnsi="Arial" w:cs="Arial"/>
+            <w:b/>
+            <w:bCs/>
+            <w:color w:val="auto"/>
+            <w:sz w:val="18"/>
+            <w:szCs w:val="18"/>
+            <w:lang w:val="ru-RU"/>
+          </w:rPr>
+          <w:t>База данных "За Христа пострадавшие"</w:t>
+        </w:r>
+      </w:hyperlink>
+    </w:p>
+    <w:p>
+      <w:pPr>
+        <w:spacing w:after="0"/>
+        <w:rPr>
+          <w:rFonts w:ascii="Arial" w:eastAsia="Times New Roman" w:hAnsi="Arial" w:cs="Arial"/>
+          <w:b/>
+          <w:bCs/>
+          <w:kern w:val="0"/>
+          <w:sz w:val="18"/>
+          <w:szCs w:val="18"/>
+          <w:lang w:val="ru-RU"/>
+        </w:rPr>
+      </w:pPr>
+      <w:hyperlink r:id="rId7" w:history="1">
+        <w:r>
+          <w:rPr>
+            <w:rStyle w:val="Hyperlink"/>
+            <w:rFonts w:ascii="Arial" w:hAnsi="Arial" w:cs="Arial"/>
+            <w:b/>
+            <w:bCs/>
+            <w:color w:val="auto"/>
+            <w:sz w:val="18"/>
+            <w:szCs w:val="18"/>
+            <w:lang w:val="ru-RU"/>
+          </w:rPr>
+          <w:t>Беларусь: жертвы сталинских репрессий</w:t>
+        </w:r>
+      </w:hyperlink>
+    </w:p>
+    <w:p>
+      <w:pPr>
+        <w:spacing w:after="0"/>
+        <w:rPr>
+          <w:rFonts w:ascii="Arial" w:eastAsia="Times New Roman" w:hAnsi="Arial" w:cs="Arial"/>
+          <w:b/>
+          <w:bCs/>
+          <w:kern w:val="0"/>
+          <w:sz w:val="18"/>
+          <w:szCs w:val="18"/>
+          <w:lang w:val="ru-RU"/>
+        </w:rPr>
+      </w:pPr>
+      <w:hyperlink r:id="rId8" w:history="1">
+        <w:r>
+          <w:rPr>
+            <w:rStyle w:val="Hyperlink"/>
+            <w:rFonts w:ascii="Arial" w:hAnsi="Arial" w:cs="Arial"/>
+            <w:b/>
+            <w:bCs/>
+            <w:color w:val="auto"/>
+            <w:sz w:val="18"/>
+            <w:szCs w:val="18"/>
+            <w:lang w:val="ru-RU"/>
+          </w:rPr>
+          <w:t>БЕССМЕРТНЫЙ БАРАК. Возвращенные имена. Москва и Московская область</w:t>
+        </w:r>
+      </w:hyperlink>
+    </w:p>
+    <w:p>
+      <w:pPr>
+        <w:spacing w:after="0"/>
+        <w:rPr>
+          <w:rFonts w:ascii="Arial" w:eastAsia="Times New Roman" w:hAnsi="Arial" w:cs="Arial"/>
+          <w:b/>
+          <w:bCs/>
+          <w:kern w:val="0"/>
+          <w:sz w:val="18"/>
+          <w:szCs w:val="18"/>
+          <w:lang w:val="ru-RU"/>
+        </w:rPr>
+      </w:pPr>
+      <w:hyperlink r:id="rId9" w:history="1">
+        <w:r>
+          <w:rPr>
+            <w:rStyle w:val="Hyperlink"/>
+            <w:rFonts w:ascii="Arial" w:hAnsi="Arial" w:cs="Arial"/>
+            <w:b/>
+            <w:bCs/>
+            <w:color w:val="auto"/>
+            <w:sz w:val="18"/>
+            <w:szCs w:val="18"/>
+            <w:lang w:val="ru-RU"/>
+          </w:rPr>
+          <w:t>БЕССМЕРТНЫЙ БАРАК. КНИГИ ПАМЯТИ</w:t>
+        </w:r>
+      </w:hyperlink>
+    </w:p>
+    <w:p>
+      <w:pPr>
+        <w:spacing w:after="0"/>
+        <w:rPr>
+          <w:rFonts w:ascii="Arial" w:eastAsia="Times New Roman" w:hAnsi="Arial" w:cs="Arial"/>
+          <w:b/>
+          <w:bCs/>
+          <w:kern w:val="0"/>
+          <w:sz w:val="18"/>
+          <w:szCs w:val="18"/>
+          <w:lang w:val="ru-RU"/>
+        </w:rPr>
+      </w:pPr>
+      <w:hyperlink r:id="rId10" w:history="1">
+        <w:r>
+          <w:rPr>
+            <w:rStyle w:val="Hyperlink"/>
+            <w:rFonts w:ascii="Arial" w:hAnsi="Arial" w:cs="Arial"/>
+            <w:b/>
+            <w:bCs/>
+            <w:color w:val="auto"/>
+            <w:sz w:val="18"/>
+            <w:szCs w:val="18"/>
+            <w:lang w:val="ru-RU"/>
+          </w:rPr>
+          <w:t>Бутовский полиго</w:t>
+        </w:r>
+        <w:r>
+          <w:rPr>
+            <w:rStyle w:val="Hyperlink"/>
+            <w:rFonts w:ascii="Arial" w:hAnsi="Arial" w:cs="Arial"/>
+            <w:b/>
+            <w:bCs/>
+            <w:color w:val="auto"/>
+            <w:sz w:val="18"/>
+            <w:szCs w:val="18"/>
+            <w:lang w:val="ru-RU"/>
+          </w:rPr>
+          <w:t xml:space="preserve">н НКВД в </w:t>
+        </w:r>
+        <w:proofErr w:type="gramStart"/>
+        <w:r>
+          <w:rPr>
+            <w:rStyle w:val="Hyperlink"/>
+            <w:rFonts w:ascii="Arial" w:hAnsi="Arial" w:cs="Arial"/>
+            <w:b/>
+            <w:bCs/>
+            <w:color w:val="auto"/>
+            <w:sz w:val="18"/>
+            <w:szCs w:val="18"/>
+            <w:lang w:val="ru-RU"/>
+          </w:rPr>
+          <w:t>1937-1938</w:t>
+        </w:r>
+        <w:proofErr w:type="gramEnd"/>
+        <w:r>
+          <w:rPr>
+            <w:rStyle w:val="Hyperlink"/>
+            <w:rFonts w:ascii="Arial" w:hAnsi="Arial" w:cs="Arial"/>
+            <w:b/>
+            <w:bCs/>
+            <w:color w:val="auto"/>
+            <w:sz w:val="18"/>
+            <w:szCs w:val="18"/>
+            <w:lang w:val="ru-RU"/>
+          </w:rPr>
+          <w:t xml:space="preserve"> гг.</w:t>
+        </w:r>
+      </w:hyperlink>
+      <w:r>
+        <w:rPr>
+          <w:rFonts w:ascii="Arial" w:eastAsia="Times New Roman" w:hAnsi="Arial" w:cs="Arial"/>
+          <w:b/>
+          <w:bCs/>
+          <w:kern w:val="0"/>
+          <w:sz w:val="18"/>
+          <w:szCs w:val="18"/>
+          <w:lang w:val="ru-RU"/>
+        </w:rPr>
+        <w:t xml:space="preserve"> </w:t>
+      </w:r>
+    </w:p>
+    <w:p>
+      <w:pPr>
+        <w:spacing w:after="0"/>
+        <w:rPr>
+          <w:rFonts w:ascii="Arial" w:hAnsi="Arial" w:cs="Arial"/>
+          <w:sz w:val="18"/>
+          <w:szCs w:val="18"/>
+          <w:lang w:val="ru-RU"/>
+        </w:rPr>
+      </w:pPr>
+      <w:hyperlink r:id="rId11" w:tgtFrame="_blank" w:history="1">
+        <w:r>
+          <w:rPr>
+            <w:rStyle w:val="Hyperlink"/>
+            <w:rFonts w:ascii="Arial" w:hAnsi="Arial" w:cs="Arial"/>
+            <w:b/>
+            <w:bCs/>
+            <w:color w:val="auto"/>
+            <w:sz w:val="18"/>
+            <w:szCs w:val="18"/>
+            <w:lang w:val="ru-RU"/>
+          </w:rPr>
+          <w:t>ВОЗВРАЩЕННЫЕ ИМЕНА. КНИГИ ПАМЯТИ РОССИИ</w:t>
+        </w:r>
+      </w:hyperlink>
+      <w:r>
+        <w:rPr>
+          <w:rFonts w:ascii="Arial" w:hAnsi="Arial" w:cs="Arial"/>
+          <w:sz w:val="18"/>
+          <w:szCs w:val="18"/>
+          <w:lang w:val="ru-RU"/>
+        </w:rPr>
+        <w:t xml:space="preserve"> </w:t>
+      </w:r>
+    </w:p>
+    <w:p>
+      <w:pPr>
+        <w:spacing w:after="0"/>
+        <w:rPr>
+          <w:rFonts w:ascii="Arial" w:eastAsia="Times New Roman" w:hAnsi="Arial" w:cs="Arial"/>
+          <w:b/>
+          <w:bCs/>
+          <w:kern w:val="0"/>
+          <w:sz w:val="18"/>
+          <w:szCs w:val="18"/>
+          <w:lang w:val="ru-RU"/>
+        </w:rPr>
+      </w:pPr>
+      <w:hyperlink r:id="rId12" w:tgtFrame="_blank" w:history="1">
+        <w:r>
+          <w:rPr>
+            <w:rStyle w:val="Hyperlink"/>
+            <w:rFonts w:ascii="Arial" w:eastAsia="Times New Roman" w:hAnsi="Arial" w:cs="Arial"/>
+            <w:b/>
+            <w:bCs/>
+            <w:color w:val="auto"/>
+            <w:kern w:val="0"/>
+            <w:sz w:val="18"/>
+            <w:szCs w:val="18"/>
+            <w:lang w:val="ru-RU"/>
+          </w:rPr>
+          <w:t xml:space="preserve">ЖЕРТВЫ АНТИПОЛЬСКОГО ТЕРРОРА В СОВЕТСКОМ СОЮЗЕ </w:t>
+        </w:r>
+        <w:proofErr w:type="gramStart"/>
+        <w:r>
+          <w:rPr>
+            <w:rStyle w:val="Hyperlink"/>
+            <w:rFonts w:ascii="Arial" w:eastAsia="Times New Roman" w:hAnsi="Arial" w:cs="Arial"/>
+            <w:b/>
+            <w:bCs/>
+            <w:color w:val="auto"/>
+            <w:kern w:val="0"/>
+            <w:sz w:val="18"/>
+            <w:szCs w:val="18"/>
+            <w:lang w:val="ru-RU"/>
+          </w:rPr>
+          <w:t>1934-1938</w:t>
+        </w:r>
+        <w:proofErr w:type="gramEnd"/>
+      </w:hyperlink>
+    </w:p>
+    <w:p>
+      <w:pPr>
+        <w:spacing w:after="0"/>
+        <w:rPr>
+          <w:rFonts w:ascii="Arial" w:hAnsi="Arial" w:cs="Arial"/>
+          <w:sz w:val="18"/>
+          <w:szCs w:val="18"/>
+          <w:lang w:val="ru-RU"/>
+        </w:rPr>
+      </w:pPr>
+      <w:hyperlink r:id="rId13" w:history="1">
+        <w:r>
+          <w:rPr>
+            <w:rStyle w:val="Hyperlink"/>
+            <w:rFonts w:ascii="Arial" w:hAnsi="Arial" w:cs="Arial"/>
+            <w:b/>
+            <w:bCs/>
+            <w:color w:val="auto"/>
+            <w:sz w:val="18"/>
+            <w:szCs w:val="18"/>
+            <w:lang w:val="ru-RU"/>
+          </w:rPr>
+          <w:t>Жертвы политических репрессий в Челябинской области</w:t>
+        </w:r>
+      </w:hyperlink>
+    </w:p>
+    <w:p>
+      <w:pPr>
+        <w:spacing w:after="0"/>
+        <w:rPr>
+          <w:rFonts w:ascii="Arial" w:hAnsi="Arial" w:cs="Arial"/>
+          <w:sz w:val="18"/>
+          <w:szCs w:val="18"/>
+          <w:lang w:val="ru-RU"/>
+        </w:rPr>
+      </w:pPr>
+      <w:hyperlink r:id="rId14" w:history="1">
+        <w:r>
+          <w:rPr>
+            <w:rStyle w:val="Hyperlink"/>
+            <w:rFonts w:ascii="Arial" w:hAnsi="Arial" w:cs="Arial"/>
+            <w:b/>
+            <w:bCs/>
+            <w:color w:val="auto"/>
+            <w:sz w:val="18"/>
+            <w:szCs w:val="18"/>
+            <w:lang w:val="ru-RU"/>
+          </w:rPr>
+          <w:t xml:space="preserve">Памяти репрессированных католиков </w:t>
+        </w:r>
+      </w:hyperlink>
+      <w:r>
+        <w:rPr>
+          <w:rFonts w:ascii="Arial" w:hAnsi="Arial" w:cs="Arial"/>
+          <w:sz w:val="18"/>
+          <w:szCs w:val="18"/>
+          <w:lang w:val="ru-RU"/>
+        </w:rPr>
+        <w:t xml:space="preserve"> </w:t>
+      </w:r>
+    </w:p>
+    <w:p>
+      <w:pPr>
+        <w:spacing w:after="0"/>
+        <w:rPr>
+          <w:rFonts w:ascii="Arial" w:hAnsi="Arial" w:cs="Arial"/>
+          <w:sz w:val="18"/>
+          <w:szCs w:val="18"/>
+          <w:lang w:val="ru-RU"/>
+        </w:rPr>
+      </w:pPr>
+      <w:hyperlink r:id="rId15" w:tgtFrame="_blank" w:history="1">
+        <w:r>
+          <w:rPr>
+            <w:rStyle w:val="Hyperlink"/>
+            <w:rFonts w:ascii="Arial" w:eastAsia="Times New Roman" w:hAnsi="Arial" w:cs="Arial"/>
+            <w:b/>
+            <w:bCs/>
+            <w:color w:val="auto"/>
+            <w:kern w:val="0"/>
+            <w:sz w:val="18"/>
+            <w:szCs w:val="18"/>
+            <w:lang w:val="ru-RU"/>
+          </w:rPr>
+          <w:t>КОЛЫМА</w:t>
+        </w:r>
+        <w:r>
+          <w:rPr>
+            <w:rStyle w:val="Hyperlink"/>
+            <w:rFonts w:ascii="Arial" w:eastAsia="Times New Roman" w:hAnsi="Arial" w:cs="Arial"/>
+            <w:b/>
+            <w:bCs/>
+            <w:color w:val="auto"/>
+            <w:kern w:val="0"/>
+            <w:sz w:val="18"/>
+            <w:szCs w:val="18"/>
+            <w:lang w:val="ru-RU"/>
+          </w:rPr>
+          <w:t xml:space="preserve"> </w:t>
+        </w:r>
+        <w:r>
+          <w:rPr>
+            <w:rStyle w:val="Hyperlink"/>
+            <w:rFonts w:ascii="Arial" w:eastAsia="Times New Roman" w:hAnsi="Arial" w:cs="Arial"/>
+            <w:b/>
+            <w:bCs/>
+            <w:color w:val="auto"/>
+            <w:kern w:val="0"/>
+            <w:sz w:val="18"/>
+            <w:szCs w:val="18"/>
+            <w:lang w:val="ru-RU"/>
+          </w:rPr>
+          <w:t xml:space="preserve"> </w:t>
+        </w:r>
+      </w:hyperlink>
+    </w:p>
+    <w:p>
+      <w:pPr>
+        <w:spacing w:after="0"/>
+        <w:rPr>
+          <w:rFonts w:ascii="Arial" w:eastAsia="Times New Roman" w:hAnsi="Arial" w:cs="Arial"/>
+          <w:b/>
+          <w:bCs/>
+          <w:kern w:val="0"/>
+          <w:sz w:val="18"/>
+          <w:szCs w:val="18"/>
+          <w:lang w:val="ru-RU"/>
+        </w:rPr>
+      </w:pPr>
+      <w:hyperlink r:id="rId16" w:tgtFrame="_blank" w:history="1">
+        <w:r>
+          <w:rPr>
+            <w:rStyle w:val="Hyperlink"/>
+            <w:rFonts w:ascii="Arial" w:eastAsia="Times New Roman" w:hAnsi="Arial" w:cs="Arial"/>
+            <w:b/>
+            <w:bCs/>
+            <w:color w:val="auto"/>
+            <w:kern w:val="0"/>
+            <w:sz w:val="18"/>
+            <w:szCs w:val="18"/>
+            <w:lang w:val="ru-RU"/>
+          </w:rPr>
+          <w:t xml:space="preserve">ЛЕВАШОВСКАЯ ПУСТОШЬ </w:t>
+        </w:r>
+      </w:hyperlink>
+    </w:p>
+    <w:p>
+      <w:pPr>
+        <w:spacing w:after="0"/>
+        <w:rPr>
+          <w:rFonts w:ascii="Arial" w:hAnsi="Arial" w:cs="Arial"/>
+          <w:sz w:val="18"/>
+          <w:szCs w:val="18"/>
+          <w:lang w:val="ru-RU"/>
+        </w:rPr>
+      </w:pPr>
+      <w:hyperlink r:id="rId17" w:tgtFrame="_blank" w:history="1">
+        <w:proofErr w:type="spellStart"/>
+        <w:r>
+          <w:rPr>
+            <w:rStyle w:val="Hyperlink"/>
+            <w:rFonts w:ascii="Arial" w:eastAsia="Times New Roman" w:hAnsi="Arial" w:cs="Arial"/>
+            <w:b/>
+            <w:bCs/>
+            <w:color w:val="auto"/>
+            <w:kern w:val="0"/>
+            <w:sz w:val="18"/>
+            <w:szCs w:val="18"/>
+            <w:lang w:val="ru-RU"/>
+          </w:rPr>
+          <w:t>Нац</w:t>
+        </w:r>
+        <w:r>
+          <w:rPr>
+            <w:rStyle w:val="Hyperlink"/>
+            <w:rFonts w:ascii="Arial" w:eastAsia="Times New Roman" w:hAnsi="Arial" w:cs="Arial"/>
+            <w:b/>
+            <w:bCs/>
+            <w:color w:val="auto"/>
+            <w:kern w:val="0"/>
+            <w:sz w:val="18"/>
+            <w:szCs w:val="18"/>
+          </w:rPr>
+          <w:t>i</w:t>
+        </w:r>
+        <w:r>
+          <w:rPr>
+            <w:rStyle w:val="Hyperlink"/>
+            <w:rFonts w:ascii="Arial" w:eastAsia="Times New Roman" w:hAnsi="Arial" w:cs="Arial"/>
+            <w:b/>
+            <w:bCs/>
+            <w:color w:val="auto"/>
+            <w:kern w:val="0"/>
+            <w:sz w:val="18"/>
+            <w:szCs w:val="18"/>
+            <w:lang w:val="ru-RU"/>
+          </w:rPr>
+          <w:t>ональный</w:t>
+        </w:r>
+        <w:proofErr w:type="spellEnd"/>
+        <w:r>
+          <w:rPr>
+            <w:rStyle w:val="Hyperlink"/>
+            <w:rFonts w:ascii="Arial" w:eastAsia="Times New Roman" w:hAnsi="Arial" w:cs="Arial"/>
+            <w:b/>
+            <w:bCs/>
+            <w:color w:val="auto"/>
+            <w:kern w:val="0"/>
+            <w:sz w:val="18"/>
+            <w:szCs w:val="18"/>
+            <w:lang w:val="ru-RU"/>
+          </w:rPr>
+          <w:t xml:space="preserve"> </w:t>
+        </w:r>
+        <w:r>
+          <w:rPr>
+            <w:rStyle w:val="Hyperlink"/>
+            <w:rFonts w:ascii="Arial" w:eastAsia="Times New Roman" w:hAnsi="Arial" w:cs="Arial"/>
+            <w:b/>
+            <w:bCs/>
+            <w:color w:val="auto"/>
+            <w:kern w:val="0"/>
+            <w:sz w:val="18"/>
+            <w:szCs w:val="18"/>
+            <w:lang w:val="ru-RU"/>
+          </w:rPr>
+          <w:t>б</w:t>
+        </w:r>
+        <w:r>
+          <w:rPr>
+            <w:rStyle w:val="Hyperlink"/>
+            <w:rFonts w:ascii="Arial" w:eastAsia="Times New Roman" w:hAnsi="Arial" w:cs="Arial"/>
+            <w:b/>
+            <w:bCs/>
+            <w:color w:val="auto"/>
+            <w:kern w:val="0"/>
+            <w:sz w:val="18"/>
+            <w:szCs w:val="18"/>
+            <w:lang w:val="ru-RU"/>
+          </w:rPr>
+          <w:t xml:space="preserve">анк </w:t>
+        </w:r>
+        <w:proofErr w:type="spellStart"/>
+        <w:r>
+          <w:rPr>
+            <w:rStyle w:val="Hyperlink"/>
+            <w:rFonts w:ascii="Arial" w:eastAsia="Times New Roman" w:hAnsi="Arial" w:cs="Arial"/>
+            <w:b/>
+            <w:bCs/>
+            <w:color w:val="auto"/>
+            <w:kern w:val="0"/>
+            <w:sz w:val="18"/>
+            <w:szCs w:val="18"/>
+            <w:lang w:val="ru-RU"/>
+          </w:rPr>
+          <w:t>р</w:t>
+        </w:r>
+        <w:r>
+          <w:rPr>
+            <w:rStyle w:val="Hyperlink"/>
+            <w:rFonts w:ascii="Arial" w:eastAsia="Times New Roman" w:hAnsi="Arial" w:cs="Arial"/>
+            <w:b/>
+            <w:bCs/>
+            <w:color w:val="auto"/>
+            <w:kern w:val="0"/>
+            <w:sz w:val="18"/>
+            <w:szCs w:val="18"/>
+            <w:lang w:val="ru-RU"/>
+          </w:rPr>
+          <w:t>епрес</w:t>
+        </w:r>
+        <w:r>
+          <w:rPr>
+            <w:rStyle w:val="Hyperlink"/>
+            <w:rFonts w:ascii="Arial" w:eastAsia="Times New Roman" w:hAnsi="Arial" w:cs="Arial"/>
+            <w:b/>
+            <w:bCs/>
+            <w:color w:val="auto"/>
+            <w:kern w:val="0"/>
+            <w:sz w:val="18"/>
+            <w:szCs w:val="18"/>
+          </w:rPr>
+          <w:t>i</w:t>
+        </w:r>
+        <w:proofErr w:type="spellEnd"/>
+        <w:r>
+          <w:rPr>
+            <w:rStyle w:val="Hyperlink"/>
+            <w:rFonts w:ascii="Arial" w:eastAsia="Times New Roman" w:hAnsi="Arial" w:cs="Arial"/>
+            <w:b/>
+            <w:bCs/>
+            <w:color w:val="auto"/>
+            <w:kern w:val="0"/>
+            <w:sz w:val="18"/>
+            <w:szCs w:val="18"/>
+            <w:lang w:val="ru-RU"/>
+          </w:rPr>
+          <w:t xml:space="preserve">й </w:t>
+        </w:r>
+        <w:r>
+          <w:rPr>
+            <w:rStyle w:val="Hyperlink"/>
+            <w:rFonts w:ascii="Arial" w:eastAsia="Times New Roman" w:hAnsi="Arial" w:cs="Arial"/>
+            <w:b/>
+            <w:bCs/>
+            <w:color w:val="auto"/>
+            <w:kern w:val="0"/>
+            <w:sz w:val="18"/>
+            <w:szCs w:val="18"/>
+            <w:lang w:val="ru-RU"/>
+          </w:rPr>
+          <w:t xml:space="preserve">в </w:t>
+        </w:r>
+        <w:proofErr w:type="spellStart"/>
+        <w:r>
+          <w:rPr>
+            <w:rStyle w:val="Hyperlink"/>
+            <w:rFonts w:ascii="Arial" w:eastAsia="Times New Roman" w:hAnsi="Arial" w:cs="Arial"/>
+            <w:b/>
+            <w:bCs/>
+            <w:color w:val="auto"/>
+            <w:kern w:val="0"/>
+            <w:sz w:val="18"/>
+            <w:szCs w:val="18"/>
+            <w:lang w:val="ru-RU"/>
+          </w:rPr>
+          <w:t>Укра</w:t>
+        </w:r>
+        <w:r>
+          <w:rPr>
+            <w:rStyle w:val="Hyperlink"/>
+            <w:rFonts w:ascii="Arial" w:eastAsia="Times New Roman" w:hAnsi="Arial" w:cs="Arial"/>
+            <w:b/>
+            <w:bCs/>
+            <w:color w:val="auto"/>
+            <w:kern w:val="0"/>
+            <w:sz w:val="18"/>
+            <w:szCs w:val="18"/>
+            <w:lang w:val="ru-RU"/>
+          </w:rPr>
+          <w:t>ї</w:t>
+        </w:r>
+        <w:r>
+          <w:rPr>
+            <w:rStyle w:val="Hyperlink"/>
+            <w:rFonts w:ascii="Arial" w:eastAsia="Times New Roman" w:hAnsi="Arial" w:cs="Arial"/>
+            <w:b/>
+            <w:bCs/>
+            <w:color w:val="auto"/>
+            <w:kern w:val="0"/>
+            <w:sz w:val="18"/>
+            <w:szCs w:val="18"/>
+            <w:lang w:val="ru-RU"/>
+          </w:rPr>
+          <w:t>н</w:t>
+        </w:r>
+        <w:r>
+          <w:rPr>
+            <w:rStyle w:val="Hyperlink"/>
+            <w:rFonts w:ascii="Arial" w:eastAsia="Times New Roman" w:hAnsi="Arial" w:cs="Arial"/>
+            <w:b/>
+            <w:bCs/>
+            <w:color w:val="auto"/>
+            <w:kern w:val="0"/>
+            <w:sz w:val="18"/>
+            <w:szCs w:val="18"/>
+          </w:rPr>
+          <w:t>i</w:t>
+        </w:r>
+        <w:proofErr w:type="spellEnd"/>
+      </w:hyperlink>
+    </w:p>
+    <w:p>
+      <w:pPr>
+        <w:spacing w:after="0"/>
+        <w:rPr>
+          <w:rFonts w:ascii="Arial" w:eastAsia="Times New Roman" w:hAnsi="Arial" w:cs="Arial"/>
+          <w:b/>
+          <w:bCs/>
+          <w:kern w:val="0"/>
+          <w:sz w:val="18"/>
+          <w:szCs w:val="18"/>
+          <w:lang w:val="ru-RU"/>
+        </w:rPr>
+      </w:pPr>
+      <w:hyperlink r:id="rId18" w:tgtFrame="_blank" w:history="1">
+        <w:r>
+          <w:rPr>
+            <w:rStyle w:val="Hyperlink"/>
+            <w:rFonts w:ascii="Arial" w:eastAsia="Times New Roman" w:hAnsi="Arial" w:cs="Arial"/>
+            <w:b/>
+            <w:bCs/>
+            <w:color w:val="auto"/>
+            <w:kern w:val="0"/>
+            <w:sz w:val="18"/>
+            <w:szCs w:val="18"/>
+            <w:lang w:val="ru-RU"/>
+          </w:rPr>
+          <w:t>Немецкая операция НКВД</w:t>
+        </w:r>
+        <w:r>
+          <w:rPr>
+            <w:rStyle w:val="Hyperlink"/>
+            <w:rFonts w:ascii="Arial" w:eastAsia="Times New Roman" w:hAnsi="Arial" w:cs="Arial"/>
+            <w:b/>
+            <w:bCs/>
+            <w:color w:val="auto"/>
+            <w:kern w:val="0"/>
+            <w:sz w:val="18"/>
+            <w:szCs w:val="18"/>
+            <w:lang w:val="ru-RU"/>
+          </w:rPr>
+          <w:t xml:space="preserve"> в Москве и Московской области</w:t>
+        </w:r>
+        <w:r>
+          <w:rPr>
+            <w:rStyle w:val="Hyperlink"/>
+            <w:rFonts w:ascii="Arial" w:eastAsia="Times New Roman" w:hAnsi="Arial" w:cs="Arial"/>
+            <w:b/>
+            <w:bCs/>
+            <w:color w:val="auto"/>
+            <w:kern w:val="0"/>
+            <w:sz w:val="18"/>
+            <w:szCs w:val="18"/>
+            <w:lang w:val="ru-RU"/>
+          </w:rPr>
+          <w:t xml:space="preserve"> </w:t>
+        </w:r>
+        <w:proofErr w:type="gramStart"/>
+        <w:r>
+          <w:rPr>
+            <w:rStyle w:val="Hyperlink"/>
+            <w:rFonts w:ascii="Arial" w:eastAsia="Times New Roman" w:hAnsi="Arial" w:cs="Arial"/>
+            <w:b/>
+            <w:bCs/>
+            <w:color w:val="auto"/>
+            <w:kern w:val="0"/>
+            <w:sz w:val="18"/>
+            <w:szCs w:val="18"/>
+            <w:lang w:val="ru-RU"/>
+          </w:rPr>
+          <w:t>1934-1941</w:t>
+        </w:r>
+        <w:proofErr w:type="gramEnd"/>
+        <w:r>
+          <w:rPr>
+            <w:rStyle w:val="Hyperlink"/>
+            <w:rFonts w:ascii="Arial" w:eastAsia="Times New Roman" w:hAnsi="Arial" w:cs="Arial"/>
+            <w:b/>
+            <w:bCs/>
+            <w:color w:val="auto"/>
+            <w:kern w:val="0"/>
+            <w:sz w:val="18"/>
+            <w:szCs w:val="18"/>
+            <w:lang w:val="ru-RU"/>
+          </w:rPr>
+          <w:t xml:space="preserve"> </w:t>
+        </w:r>
+        <w:r>
+          <w:rPr>
+            <w:rStyle w:val="Hyperlink"/>
+            <w:rFonts w:ascii="Arial" w:eastAsia="Times New Roman" w:hAnsi="Arial" w:cs="Arial"/>
+            <w:b/>
+            <w:bCs/>
+            <w:color w:val="auto"/>
+            <w:kern w:val="0"/>
+            <w:sz w:val="18"/>
+            <w:szCs w:val="18"/>
+            <w:lang w:val="ru-RU"/>
+          </w:rPr>
+          <w:t>гг.</w:t>
+        </w:r>
+      </w:hyperlink>
+    </w:p>
+    <w:p>
+      <w:pPr>
+        <w:spacing w:after="0"/>
+        <w:rPr>
+          <w:rFonts w:ascii="Arial" w:eastAsia="Times New Roman" w:hAnsi="Arial" w:cs="Arial"/>
+          <w:b/>
+          <w:bCs/>
+          <w:kern w:val="0"/>
+          <w:sz w:val="18"/>
+          <w:szCs w:val="18"/>
+          <w:lang w:val="ru-RU"/>
+        </w:rPr>
+      </w:pPr>
+      <w:hyperlink r:id="rId19" w:history="1">
+        <w:r>
+          <w:rPr>
+            <w:rStyle w:val="Hyperlink"/>
+            <w:rFonts w:ascii="Arial" w:hAnsi="Arial" w:cs="Arial"/>
+            <w:b/>
+            <w:bCs/>
+            <w:color w:val="auto"/>
+            <w:sz w:val="18"/>
+            <w:szCs w:val="18"/>
+            <w:lang w:val="ru-RU"/>
+          </w:rPr>
+          <w:t>Открытый список</w:t>
+        </w:r>
+      </w:hyperlink>
+    </w:p>
+    <w:p>
+      <w:pPr>
+        <w:spacing w:after="0"/>
+        <w:rPr>
+          <w:rFonts w:ascii="Arial" w:eastAsia="Times New Roman" w:hAnsi="Arial" w:cs="Arial"/>
+          <w:b/>
+          <w:bCs/>
+          <w:kern w:val="0"/>
+          <w:sz w:val="18"/>
+          <w:szCs w:val="18"/>
+          <w:lang w:val="ru-RU"/>
+        </w:rPr>
+      </w:pPr>
+      <w:hyperlink r:id="rId20" w:history="1">
+        <w:r>
+          <w:rPr>
+            <w:rStyle w:val="Hyperlink"/>
+            <w:rFonts w:ascii="Arial" w:hAnsi="Arial" w:cs="Arial"/>
+            <w:b/>
+            <w:bCs/>
+            <w:color w:val="auto"/>
+            <w:sz w:val="18"/>
+            <w:szCs w:val="18"/>
+            <w:lang w:val="ru-RU"/>
+          </w:rPr>
+          <w:t>Вадим Роговин</w:t>
+        </w:r>
+        <w:r>
+          <w:rPr>
+            <w:rStyle w:val="Hyperlink"/>
+            <w:rFonts w:ascii="Arial" w:hAnsi="Arial" w:cs="Arial"/>
+            <w:b/>
+            <w:bCs/>
+            <w:color w:val="auto"/>
+            <w:sz w:val="18"/>
+            <w:szCs w:val="18"/>
+            <w:lang w:val="ru-RU"/>
+          </w:rPr>
+          <w:t>.</w:t>
+        </w:r>
+        <w:r>
+          <w:rPr>
+            <w:rStyle w:val="Hyperlink"/>
+            <w:rFonts w:ascii="Arial" w:hAnsi="Arial" w:cs="Arial"/>
+            <w:b/>
+            <w:bCs/>
+            <w:color w:val="auto"/>
+            <w:sz w:val="18"/>
+            <w:szCs w:val="18"/>
+            <w:lang w:val="ru-RU"/>
+          </w:rPr>
+          <w:t xml:space="preserve"> </w:t>
+        </w:r>
+        <w:r>
+          <w:rPr>
+            <w:rStyle w:val="Hyperlink"/>
+            <w:rFonts w:ascii="Arial" w:hAnsi="Arial" w:cs="Arial"/>
+            <w:b/>
+            <w:bCs/>
+            <w:color w:val="auto"/>
+            <w:sz w:val="18"/>
+            <w:szCs w:val="18"/>
+            <w:lang w:val="ru-RU"/>
+          </w:rPr>
+          <w:t>П</w:t>
+        </w:r>
+        <w:r>
+          <w:rPr>
+            <w:rStyle w:val="Hyperlink"/>
+            <w:rFonts w:ascii="Arial" w:hAnsi="Arial" w:cs="Arial"/>
+            <w:b/>
+            <w:bCs/>
+            <w:color w:val="auto"/>
+            <w:sz w:val="18"/>
+            <w:szCs w:val="18"/>
+            <w:lang w:val="ru-RU"/>
+          </w:rPr>
+          <w:t>артия расстрелянных</w:t>
+        </w:r>
+        <w:r>
+          <w:rPr>
+            <w:rStyle w:val="Hyperlink"/>
+            <w:rFonts w:ascii="Arial" w:hAnsi="Arial" w:cs="Arial"/>
+            <w:b/>
+            <w:bCs/>
+            <w:color w:val="auto"/>
+            <w:sz w:val="18"/>
+            <w:szCs w:val="18"/>
+            <w:lang w:val="ru-RU"/>
+          </w:rPr>
+          <w:t xml:space="preserve"> </w:t>
+        </w:r>
+      </w:hyperlink>
+    </w:p>
+    <w:p>
+      <w:pPr>
+        <w:spacing w:after="0"/>
+        <w:rPr>
+          <w:rFonts w:ascii="Arial" w:hAnsi="Arial" w:cs="Arial"/>
+          <w:sz w:val="18"/>
+          <w:szCs w:val="18"/>
+          <w:lang w:val="ru-RU"/>
+        </w:rPr>
+      </w:pPr>
+      <w:hyperlink r:id="rId21" w:history="1">
+        <w:r>
+          <w:rPr>
+            <w:rStyle w:val="Hyperlink"/>
+            <w:rFonts w:ascii="Arial" w:hAnsi="Arial" w:cs="Arial"/>
+            <w:b/>
+            <w:bCs/>
+            <w:color w:val="auto"/>
+            <w:sz w:val="18"/>
+            <w:szCs w:val="18"/>
+            <w:lang w:val="ru-RU"/>
+          </w:rPr>
+          <w:t>Расстрелянные в Москве</w:t>
+        </w:r>
+      </w:hyperlink>
+    </w:p>
+    <w:p>
+      <w:pPr>
+        <w:spacing w:after="0"/>
+        <w:rPr>
+          <w:rFonts w:ascii="Arial" w:eastAsia="Times New Roman" w:hAnsi="Arial" w:cs="Arial"/>
+          <w:b/>
+          <w:bCs/>
+          <w:kern w:val="0"/>
+          <w:sz w:val="18"/>
+          <w:szCs w:val="18"/>
+          <w:lang w:val="ru-RU"/>
+        </w:rPr>
+      </w:pPr>
+      <w:hyperlink r:id="rId22" w:history="1">
+        <w:r>
+          <w:rPr>
+            <w:rStyle w:val="Hyperlink"/>
+            <w:rFonts w:ascii="Arial" w:hAnsi="Arial" w:cs="Arial"/>
+            <w:b/>
+            <w:bCs/>
+            <w:color w:val="auto"/>
+            <w:sz w:val="18"/>
+            <w:szCs w:val="18"/>
+            <w:lang w:val="ru-RU"/>
+          </w:rPr>
+          <w:t xml:space="preserve">Расстрелянные в </w:t>
+        </w:r>
+        <w:r>
+          <w:rPr>
+            <w:rStyle w:val="Hyperlink"/>
+            <w:rFonts w:ascii="Arial" w:hAnsi="Arial" w:cs="Arial"/>
+            <w:b/>
+            <w:bCs/>
+            <w:color w:val="auto"/>
+            <w:sz w:val="18"/>
+            <w:szCs w:val="18"/>
+            <w:lang w:val="ru-RU"/>
+          </w:rPr>
+          <w:t xml:space="preserve">тюрьмах </w:t>
+        </w:r>
+        <w:r>
+          <w:rPr>
+            <w:rStyle w:val="Hyperlink"/>
+            <w:rFonts w:ascii="Arial" w:hAnsi="Arial" w:cs="Arial"/>
+            <w:b/>
+            <w:bCs/>
+            <w:color w:val="auto"/>
+            <w:sz w:val="18"/>
+            <w:szCs w:val="18"/>
+            <w:lang w:val="ru-RU"/>
+          </w:rPr>
+          <w:t>Льв</w:t>
+        </w:r>
+        <w:r>
+          <w:rPr>
+            <w:rStyle w:val="Hyperlink"/>
+            <w:rFonts w:ascii="Arial" w:hAnsi="Arial" w:cs="Arial"/>
+            <w:b/>
+            <w:bCs/>
+            <w:color w:val="auto"/>
+            <w:sz w:val="18"/>
+            <w:szCs w:val="18"/>
+            <w:lang w:val="ru-RU"/>
+          </w:rPr>
+          <w:t>ова</w:t>
+        </w:r>
+        <w:r>
+          <w:rPr>
+            <w:rStyle w:val="Hyperlink"/>
+            <w:rFonts w:ascii="Arial" w:hAnsi="Arial" w:cs="Arial"/>
+            <w:b/>
+            <w:bCs/>
+            <w:color w:val="auto"/>
+            <w:sz w:val="18"/>
+            <w:szCs w:val="18"/>
+            <w:lang w:val="ru-RU"/>
+          </w:rPr>
+          <w:t xml:space="preserve"> </w:t>
+        </w:r>
+        <w:r>
+          <w:rPr>
+            <w:rStyle w:val="Hyperlink"/>
+            <w:rFonts w:ascii="Arial" w:hAnsi="Arial" w:cs="Arial"/>
+            <w:b/>
+            <w:bCs/>
+            <w:color w:val="auto"/>
+            <w:sz w:val="18"/>
+            <w:szCs w:val="18"/>
+            <w:lang w:val="ru-RU"/>
+          </w:rPr>
+          <w:t>в июне-июле</w:t>
+        </w:r>
+        <w:r>
+          <w:rPr>
+            <w:rStyle w:val="Hyperlink"/>
+            <w:rFonts w:ascii="Arial" w:hAnsi="Arial" w:cs="Arial"/>
+            <w:b/>
+            <w:bCs/>
+            <w:color w:val="auto"/>
+            <w:sz w:val="18"/>
+            <w:szCs w:val="18"/>
+            <w:lang w:val="ru-RU"/>
+          </w:rPr>
+          <w:t xml:space="preserve"> 1941 го</w:t>
+        </w:r>
+        <w:r>
+          <w:rPr>
+            <w:rStyle w:val="Hyperlink"/>
+            <w:rFonts w:ascii="Arial" w:hAnsi="Arial" w:cs="Arial"/>
+            <w:b/>
+            <w:bCs/>
+            <w:color w:val="auto"/>
+            <w:sz w:val="18"/>
+            <w:szCs w:val="18"/>
+            <w:lang w:val="ru-RU"/>
+          </w:rPr>
+          <w:t xml:space="preserve">да </w:t>
+        </w:r>
+      </w:hyperlink>
+    </w:p>
+    <w:p>
+      <w:pPr>
+        <w:spacing w:after="0"/>
+        <w:rPr>
+          <w:rFonts w:ascii="Arial" w:eastAsia="Times New Roman" w:hAnsi="Arial" w:cs="Arial"/>
+          <w:b/>
+          <w:bCs/>
+          <w:kern w:val="0"/>
+          <w:sz w:val="18"/>
+          <w:szCs w:val="18"/>
+          <w:lang w:val="ru-RU"/>
+        </w:rPr>
+      </w:pPr>
+      <w:hyperlink r:id="rId23" w:history="1">
+        <w:r>
+          <w:rPr>
+            <w:rStyle w:val="Hyperlink"/>
+            <w:rFonts w:ascii="Arial" w:hAnsi="Arial" w:cs="Arial"/>
+            <w:b/>
+            <w:bCs/>
+            <w:color w:val="auto"/>
+            <w:sz w:val="18"/>
+            <w:szCs w:val="18"/>
+            <w:lang w:val="ru-RU"/>
+          </w:rPr>
+          <w:t>Расстрелянные женщины Смоленщины</w:t>
+        </w:r>
+      </w:hyperlink>
+    </w:p>
+    <w:p>
+      <w:pPr>
+        <w:spacing w:after="0"/>
+        <w:rPr>
+          <w:rFonts w:ascii="Arial" w:eastAsia="Times New Roman" w:hAnsi="Arial" w:cs="Arial"/>
+          <w:b/>
+          <w:bCs/>
+          <w:kern w:val="0"/>
+          <w:sz w:val="18"/>
+          <w:szCs w:val="18"/>
+          <w:lang w:val="ru-RU"/>
+        </w:rPr>
+      </w:pPr>
+      <w:hyperlink r:id="rId24" w:history="1">
+        <w:r>
+          <w:rPr>
+            <w:rStyle w:val="Hyperlink"/>
+            <w:rFonts w:ascii="Arial" w:hAnsi="Arial" w:cs="Arial"/>
+            <w:b/>
+            <w:bCs/>
+            <w:color w:val="auto"/>
+            <w:sz w:val="18"/>
+            <w:szCs w:val="18"/>
+            <w:lang w:val="ru-RU"/>
+          </w:rPr>
+          <w:t>Репрессированные в Житомирской област</w:t>
+        </w:r>
+        <w:r>
+          <w:rPr>
+            <w:rStyle w:val="Hyperlink"/>
+            <w:rFonts w:ascii="Arial" w:hAnsi="Arial" w:cs="Arial"/>
+            <w:b/>
+            <w:bCs/>
+            <w:color w:val="auto"/>
+            <w:sz w:val="18"/>
+            <w:szCs w:val="18"/>
+            <w:lang w:val="ru-RU"/>
+          </w:rPr>
+          <w:t>и</w:t>
+        </w:r>
+        <w:r>
+          <w:rPr>
+            <w:rStyle w:val="Hyperlink"/>
+            <w:rFonts w:ascii="Arial" w:hAnsi="Arial" w:cs="Arial"/>
+            <w:b/>
+            <w:bCs/>
+            <w:color w:val="auto"/>
+            <w:sz w:val="18"/>
+            <w:szCs w:val="18"/>
+            <w:lang w:val="ru-RU"/>
+          </w:rPr>
+          <w:t xml:space="preserve">, Украина </w:t>
+        </w:r>
+      </w:hyperlink>
+    </w:p>
+    <w:p>
+      <w:pPr>
+        <w:spacing w:after="0"/>
+        <w:rPr>
+          <w:rFonts w:ascii="Arial" w:hAnsi="Arial" w:cs="Arial"/>
+          <w:sz w:val="18"/>
+          <w:szCs w:val="18"/>
+          <w:lang w:val="ru-RU"/>
+        </w:rPr>
+      </w:pPr>
+      <w:hyperlink r:id="rId25" w:history="1">
+        <w:proofErr w:type="spellStart"/>
+        <w:r>
+          <w:rPr>
+            <w:rStyle w:val="Hyperlink"/>
+            <w:rFonts w:ascii="Arial" w:hAnsi="Arial" w:cs="Arial"/>
+            <w:b/>
+            <w:bCs/>
+            <w:color w:val="auto"/>
+            <w:sz w:val="18"/>
+            <w:szCs w:val="18"/>
+            <w:lang w:val="ru-RU"/>
+          </w:rPr>
+          <w:t>Рувики</w:t>
+        </w:r>
+        <w:proofErr w:type="spellEnd"/>
+        <w:r>
+          <w:rPr>
+            <w:rStyle w:val="Hyperlink"/>
+            <w:rFonts w:ascii="Arial" w:hAnsi="Arial" w:cs="Arial"/>
+            <w:b/>
+            <w:bCs/>
+            <w:color w:val="auto"/>
+            <w:sz w:val="18"/>
+            <w:szCs w:val="18"/>
+            <w:lang w:val="ru-RU"/>
+          </w:rPr>
+          <w:t>. Большой террор</w:t>
+        </w:r>
+      </w:hyperlink>
+    </w:p>
+    <w:p>
+      <w:pPr>
+        <w:spacing w:after="0"/>
+        <w:rPr>
+          <w:rFonts w:ascii="Arial" w:eastAsia="Times New Roman" w:hAnsi="Arial" w:cs="Arial"/>
+          <w:b/>
+          <w:bCs/>
+          <w:kern w:val="0"/>
+          <w:sz w:val="18"/>
+          <w:szCs w:val="18"/>
+          <w:lang w:val="ru-RU"/>
+        </w:rPr>
+      </w:pPr>
+      <w:hyperlink r:id="rId26" w:history="1">
+        <w:proofErr w:type="spellStart"/>
+        <w:r>
+          <w:rPr>
+            <w:rStyle w:val="Hyperlink"/>
+            <w:rFonts w:ascii="Arial" w:hAnsi="Arial" w:cs="Arial"/>
+            <w:b/>
+            <w:bCs/>
+            <w:color w:val="auto"/>
+            <w:sz w:val="18"/>
+            <w:szCs w:val="18"/>
+            <w:lang w:val="ru-RU"/>
+          </w:rPr>
+          <w:t>Сандормох</w:t>
+        </w:r>
+        <w:proofErr w:type="spellEnd"/>
+        <w:r>
+          <w:rPr>
+            <w:rStyle w:val="Hyperlink"/>
+            <w:rFonts w:ascii="Arial" w:hAnsi="Arial" w:cs="Arial"/>
+            <w:b/>
+            <w:bCs/>
+            <w:color w:val="auto"/>
+            <w:sz w:val="18"/>
+            <w:szCs w:val="18"/>
+            <w:lang w:val="ru-RU"/>
+          </w:rPr>
+          <w:t>. Имена на памятниках</w:t>
+        </w:r>
+      </w:hyperlink>
+    </w:p>
+    <w:p>
+      <w:pPr>
+        <w:spacing w:after="0"/>
+        <w:rPr>
+          <w:rFonts w:ascii="Arial" w:eastAsia="Times New Roman" w:hAnsi="Arial" w:cs="Arial"/>
+          <w:b/>
+          <w:bCs/>
+          <w:kern w:val="0"/>
+          <w:sz w:val="18"/>
+          <w:szCs w:val="18"/>
+          <w:lang w:val="ru-RU"/>
+        </w:rPr>
+      </w:pPr>
+      <w:hyperlink r:id="rId27" w:history="1">
+        <w:r>
+          <w:rPr>
+            <w:rStyle w:val="Hyperlink"/>
+            <w:rFonts w:ascii="Arial" w:hAnsi="Arial" w:cs="Arial"/>
+            <w:b/>
+            <w:bCs/>
+            <w:color w:val="auto"/>
+            <w:sz w:val="18"/>
+            <w:szCs w:val="18"/>
+            <w:lang w:val="ru-RU"/>
+          </w:rPr>
+          <w:t xml:space="preserve">Сахаровский центр. Мартиролог </w:t>
+        </w:r>
+        <w:r>
+          <w:rPr>
+            <w:rStyle w:val="Hyperlink"/>
+            <w:rFonts w:ascii="Arial" w:hAnsi="Arial" w:cs="Arial"/>
+            <w:b/>
+            <w:bCs/>
+            <w:color w:val="auto"/>
+            <w:sz w:val="18"/>
+            <w:szCs w:val="18"/>
+            <w:lang w:val="ru-RU"/>
+          </w:rPr>
+          <w:t xml:space="preserve">жертв </w:t>
+        </w:r>
+        <w:r>
+          <w:rPr>
+            <w:rStyle w:val="Hyperlink"/>
+            <w:rFonts w:ascii="Arial" w:hAnsi="Arial" w:cs="Arial"/>
+            <w:b/>
+            <w:bCs/>
+            <w:color w:val="auto"/>
+            <w:sz w:val="18"/>
+            <w:szCs w:val="18"/>
+            <w:lang w:val="ru-RU"/>
+          </w:rPr>
+          <w:t>репресси</w:t>
+        </w:r>
+        <w:r>
+          <w:rPr>
+            <w:rStyle w:val="Hyperlink"/>
+            <w:rFonts w:ascii="Arial" w:hAnsi="Arial" w:cs="Arial"/>
+            <w:b/>
+            <w:bCs/>
+            <w:color w:val="auto"/>
+            <w:sz w:val="18"/>
+            <w:szCs w:val="18"/>
+            <w:lang w:val="ru-RU"/>
+          </w:rPr>
+          <w:t xml:space="preserve">й в Москве и Московской обл. </w:t>
+        </w:r>
+        <w:proofErr w:type="gramStart"/>
+        <w:r>
+          <w:rPr>
+            <w:rStyle w:val="Hyperlink"/>
+            <w:rFonts w:ascii="Arial" w:hAnsi="Arial" w:cs="Arial"/>
+            <w:b/>
+            <w:bCs/>
+            <w:color w:val="auto"/>
+            <w:sz w:val="18"/>
+            <w:szCs w:val="18"/>
+            <w:lang w:val="ru-RU"/>
+          </w:rPr>
+          <w:t>1918-1953</w:t>
+        </w:r>
+        <w:proofErr w:type="gramEnd"/>
+        <w:r>
+          <w:rPr>
+            <w:rStyle w:val="Hyperlink"/>
+            <w:rFonts w:ascii="Arial" w:hAnsi="Arial" w:cs="Arial"/>
+            <w:b/>
+            <w:bCs/>
+            <w:color w:val="auto"/>
+            <w:sz w:val="18"/>
+            <w:szCs w:val="18"/>
+            <w:lang w:val="ru-RU"/>
+          </w:rPr>
+          <w:t xml:space="preserve"> гг. </w:t>
+        </w:r>
+      </w:hyperlink>
+    </w:p>
+    <w:p>
+      <w:pPr>
+        <w:spacing w:after="0"/>
+        <w:rPr>
+          <w:rFonts w:ascii="Arial" w:hAnsi="Arial" w:cs="Arial"/>
+          <w:sz w:val="18"/>
+          <w:szCs w:val="18"/>
+          <w:lang w:val="ru-RU"/>
+        </w:rPr>
+      </w:pPr>
+      <w:hyperlink r:id="rId28" w:history="1">
+        <w:r>
+          <w:rPr>
+            <w:rStyle w:val="Hyperlink"/>
+            <w:rFonts w:ascii="Arial" w:hAnsi="Arial" w:cs="Arial"/>
+            <w:b/>
+            <w:bCs/>
+            <w:color w:val="auto"/>
+            <w:sz w:val="18"/>
+            <w:szCs w:val="18"/>
+            <w:lang w:val="ru-RU"/>
+          </w:rPr>
+          <w:t>Списки Карлага</w:t>
+        </w:r>
+      </w:hyperlink>
+    </w:p>
+    <w:p>
+      <w:pPr>
+        <w:spacing w:after="0"/>
+        <w:rPr>
+          <w:rFonts w:ascii="Arial" w:eastAsia="Times New Roman" w:hAnsi="Arial" w:cs="Arial"/>
+          <w:b/>
+          <w:bCs/>
+          <w:kern w:val="0"/>
+          <w:sz w:val="18"/>
+          <w:szCs w:val="18"/>
+          <w:lang w:val="ru-RU"/>
+        </w:rPr>
+      </w:pPr>
+      <w:hyperlink r:id="rId29" w:history="1">
+        <w:r>
+          <w:rPr>
+            <w:rStyle w:val="Hyperlink"/>
+            <w:rFonts w:ascii="Arial" w:hAnsi="Arial" w:cs="Arial"/>
+            <w:b/>
+            <w:bCs/>
+            <w:color w:val="auto"/>
+            <w:sz w:val="18"/>
+            <w:szCs w:val="18"/>
+            <w:lang w:val="ru-RU"/>
+          </w:rPr>
+          <w:t xml:space="preserve">Список </w:t>
+        </w:r>
+        <w:proofErr w:type="spellStart"/>
+        <w:r>
+          <w:rPr>
+            <w:rStyle w:val="Hyperlink"/>
+            <w:rFonts w:ascii="Arial" w:hAnsi="Arial" w:cs="Arial"/>
+            <w:b/>
+            <w:bCs/>
+            <w:color w:val="auto"/>
+            <w:sz w:val="18"/>
+            <w:szCs w:val="18"/>
+            <w:lang w:val="ru-RU"/>
+          </w:rPr>
+          <w:t>р</w:t>
+        </w:r>
+        <w:r>
+          <w:rPr>
+            <w:rStyle w:val="Hyperlink"/>
+            <w:rFonts w:ascii="Arial" w:hAnsi="Arial" w:cs="Arial"/>
+            <w:b/>
+            <w:bCs/>
+            <w:color w:val="auto"/>
+            <w:sz w:val="18"/>
+            <w:szCs w:val="18"/>
+            <w:lang w:val="ru-RU"/>
+          </w:rPr>
+          <w:t>ерессириванных</w:t>
+        </w:r>
+        <w:proofErr w:type="spellEnd"/>
+        <w:r>
+          <w:rPr>
+            <w:rStyle w:val="Hyperlink"/>
+            <w:rFonts w:ascii="Arial" w:hAnsi="Arial" w:cs="Arial"/>
+            <w:b/>
+            <w:bCs/>
+            <w:color w:val="auto"/>
+            <w:sz w:val="18"/>
+            <w:szCs w:val="18"/>
+            <w:lang w:val="ru-RU"/>
+          </w:rPr>
+          <w:t xml:space="preserve"> </w:t>
+        </w:r>
+        <w:r>
+          <w:rPr>
+            <w:rStyle w:val="Hyperlink"/>
+            <w:rFonts w:ascii="Arial" w:hAnsi="Arial" w:cs="Arial"/>
+            <w:b/>
+            <w:bCs/>
+            <w:color w:val="auto"/>
+            <w:sz w:val="18"/>
+            <w:szCs w:val="18"/>
+            <w:lang w:val="ru-RU"/>
+          </w:rPr>
+          <w:t>ф</w:t>
+        </w:r>
+        <w:r>
+          <w:rPr>
+            <w:rStyle w:val="Hyperlink"/>
+            <w:rFonts w:ascii="Arial" w:hAnsi="Arial" w:cs="Arial"/>
+            <w:b/>
+            <w:bCs/>
+            <w:color w:val="auto"/>
+            <w:sz w:val="18"/>
+            <w:szCs w:val="18"/>
+            <w:lang w:val="ru-RU"/>
+          </w:rPr>
+          <w:t>иннов</w:t>
+        </w:r>
+      </w:hyperlink>
+    </w:p>
+    <w:p>
+      <w:pPr>
+        <w:spacing w:after="0"/>
+        <w:rPr>
+          <w:rFonts w:ascii="Arial" w:eastAsia="Times New Roman" w:hAnsi="Arial" w:cs="Arial"/>
+          <w:b/>
+          <w:bCs/>
+          <w:kern w:val="0"/>
+          <w:sz w:val="18"/>
+          <w:szCs w:val="18"/>
+          <w:lang w:val="ru-RU"/>
+        </w:rPr>
+      </w:pPr>
+      <w:hyperlink r:id="rId30" w:history="1">
+        <w:r>
+          <w:rPr>
+            <w:rStyle w:val="Hyperlink"/>
+            <w:rFonts w:ascii="Arial" w:hAnsi="Arial" w:cs="Arial"/>
+            <w:b/>
+            <w:bCs/>
+            <w:color w:val="auto"/>
+            <w:sz w:val="18"/>
+            <w:szCs w:val="18"/>
+            <w:lang w:val="ru-RU"/>
+          </w:rPr>
+          <w:t>Томск. Следственная тюрьма НКВД</w:t>
+        </w:r>
+      </w:hyperlink>
+    </w:p>
+    <w:p>
+      <w:pPr>
+        <w:spacing w:after="0"/>
+        <w:rPr>
+          <w:rFonts w:ascii="Arial" w:eastAsia="Times New Roman" w:hAnsi="Arial" w:cs="Arial"/>
+          <w:b/>
+          <w:bCs/>
+          <w:kern w:val="0"/>
+          <w:sz w:val="18"/>
+          <w:szCs w:val="18"/>
+          <w:lang w:val="ru-RU"/>
+        </w:rPr>
+      </w:pPr>
+      <w:hyperlink r:id="rId31" w:history="1">
+        <w:r>
+          <w:rPr>
+            <w:rStyle w:val="Hyperlink"/>
+            <w:rFonts w:ascii="Arial" w:hAnsi="Arial" w:cs="Arial"/>
+            <w:b/>
+            <w:bCs/>
+            <w:color w:val="auto"/>
+            <w:sz w:val="18"/>
+            <w:szCs w:val="18"/>
+            <w:lang w:val="ru-RU"/>
+          </w:rPr>
+          <w:t xml:space="preserve">Убиты в </w:t>
+        </w:r>
+        <w:proofErr w:type="spellStart"/>
+        <w:r>
+          <w:rPr>
+            <w:rStyle w:val="Hyperlink"/>
+            <w:rFonts w:ascii="Arial" w:hAnsi="Arial" w:cs="Arial"/>
+            <w:b/>
+            <w:bCs/>
+            <w:color w:val="auto"/>
+            <w:sz w:val="18"/>
+            <w:szCs w:val="18"/>
+            <w:lang w:val="ru-RU"/>
+          </w:rPr>
+          <w:t>Сандормохе</w:t>
+        </w:r>
+        <w:proofErr w:type="spellEnd"/>
+        <w:r>
+          <w:rPr>
+            <w:rStyle w:val="Hyperlink"/>
+            <w:rFonts w:ascii="Arial" w:hAnsi="Arial" w:cs="Arial"/>
+            <w:b/>
+            <w:bCs/>
+            <w:color w:val="auto"/>
+            <w:sz w:val="18"/>
+            <w:szCs w:val="18"/>
+            <w:lang w:val="ru-RU"/>
+          </w:rPr>
+          <w:t>. Мемориальное кладбище</w:t>
+        </w:r>
+      </w:hyperlink>
+    </w:p>
+    <w:p>
+      <w:pPr>
+        <w:spacing w:after="0"/>
+        <w:rPr>
+          <w:rFonts w:ascii="Arial" w:eastAsia="Times New Roman" w:hAnsi="Arial" w:cs="Arial"/>
+          <w:b/>
+          <w:bCs/>
+          <w:kern w:val="0"/>
+          <w:sz w:val="18"/>
+          <w:szCs w:val="18"/>
+          <w:lang w:val="ru-RU"/>
+        </w:rPr>
+      </w:pPr>
+      <w:hyperlink r:id="rId32" w:history="1">
+        <w:proofErr w:type="spellStart"/>
+        <w:r>
+          <w:rPr>
+            <w:rStyle w:val="Hyperlink"/>
+            <w:rFonts w:ascii="Arial" w:hAnsi="Arial" w:cs="Arial"/>
+            <w:b/>
+            <w:bCs/>
+            <w:color w:val="auto"/>
+            <w:sz w:val="18"/>
+            <w:szCs w:val="18"/>
+            <w:lang w:val="ru-RU"/>
+          </w:rPr>
+          <w:t>Укра</w:t>
+        </w:r>
+        <w:r>
+          <w:rPr>
+            <w:rFonts w:ascii="Arial" w:hAnsi="Arial" w:cs="Arial"/>
+            <w:b/>
+            <w:bCs/>
+            <w:sz w:val="18"/>
+            <w:szCs w:val="18"/>
+            <w:lang w:val="ru-RU"/>
+          </w:rPr>
+          <w:t>ї</w:t>
+        </w:r>
+        <w:r>
+          <w:rPr>
+            <w:rStyle w:val="Hyperlink"/>
+            <w:rFonts w:ascii="Arial" w:hAnsi="Arial" w:cs="Arial"/>
+            <w:b/>
+            <w:bCs/>
+            <w:color w:val="auto"/>
+            <w:sz w:val="18"/>
+            <w:szCs w:val="18"/>
+            <w:lang w:val="ru-RU"/>
+          </w:rPr>
+          <w:t>нський</w:t>
+        </w:r>
+        <w:proofErr w:type="spellEnd"/>
+        <w:r>
+          <w:rPr>
+            <w:rStyle w:val="Hyperlink"/>
+            <w:rFonts w:ascii="Arial" w:hAnsi="Arial" w:cs="Arial"/>
+            <w:b/>
+            <w:bCs/>
+            <w:color w:val="auto"/>
+            <w:sz w:val="18"/>
+            <w:szCs w:val="18"/>
+            <w:lang w:val="ru-RU"/>
+          </w:rPr>
+          <w:t xml:space="preserve"> мартиролог ХХ ст.</w:t>
+        </w:r>
+      </w:hyperlink>
+      <w:r>
+        <w:rPr>
+          <w:rFonts w:ascii="Arial" w:eastAsia="Times New Roman" w:hAnsi="Arial" w:cs="Arial"/>
+          <w:b/>
+          <w:bCs/>
+          <w:kern w:val="0"/>
+          <w:sz w:val="18"/>
+          <w:szCs w:val="18"/>
+          <w:lang w:val="ru-RU"/>
+        </w:rPr>
+        <w:t xml:space="preserve"> </w:t>
+      </w:r>
+    </w:p>
+    <w:p>
+      <w:pPr>
+        <w:spacing w:after="0"/>
+        <w:rPr>
+          <w:rFonts w:ascii="Arial" w:eastAsia="Times New Roman" w:hAnsi="Arial" w:cs="Arial"/>
+          <w:b/>
+          <w:bCs/>
+          <w:kern w:val="0"/>
+          <w:sz w:val="18"/>
+          <w:szCs w:val="18"/>
+          <w:lang w:val="ru-RU"/>
+        </w:rPr>
+      </w:pPr>
+      <w:hyperlink r:id="rId33" w:history="1">
+        <w:proofErr w:type="spellStart"/>
+        <w:r>
+          <w:rPr>
+            <w:rStyle w:val="Hyperlink"/>
+            <w:rFonts w:ascii="Arial" w:hAnsi="Arial" w:cs="Arial"/>
+            <w:b/>
+            <w:bCs/>
+            <w:color w:val="auto"/>
+            <w:sz w:val="18"/>
+            <w:szCs w:val="18"/>
+            <w:lang w:val="ru-RU"/>
+          </w:rPr>
+          <w:t>Цикло</w:t>
+        </w:r>
+        <w:r>
+          <w:rPr>
+            <w:rStyle w:val="Hyperlink"/>
+            <w:rFonts w:ascii="Arial" w:hAnsi="Arial" w:cs="Arial"/>
+            <w:b/>
+            <w:bCs/>
+            <w:color w:val="auto"/>
+            <w:sz w:val="18"/>
+            <w:szCs w:val="18"/>
+            <w:lang w:val="ru-RU"/>
+          </w:rPr>
+          <w:t>вики</w:t>
+        </w:r>
+        <w:proofErr w:type="spellEnd"/>
+        <w:r>
+          <w:rPr>
+            <w:rStyle w:val="Hyperlink"/>
+            <w:rFonts w:ascii="Arial" w:hAnsi="Arial" w:cs="Arial"/>
+            <w:b/>
+            <w:bCs/>
+            <w:color w:val="auto"/>
+            <w:sz w:val="18"/>
+            <w:szCs w:val="18"/>
+            <w:lang w:val="ru-RU"/>
+          </w:rPr>
+          <w:t>.</w:t>
+        </w:r>
+        <w:r>
+          <w:rPr>
+            <w:rStyle w:val="Hyperlink"/>
+            <w:rFonts w:ascii="Arial" w:hAnsi="Arial" w:cs="Arial"/>
+            <w:b/>
+            <w:bCs/>
+            <w:color w:val="auto"/>
+            <w:sz w:val="18"/>
+            <w:szCs w:val="18"/>
+            <w:lang w:val="ru-RU"/>
+          </w:rPr>
+          <w:t xml:space="preserve"> </w:t>
+        </w:r>
+        <w:r>
+          <w:rPr>
+            <w:rStyle w:val="Hyperlink"/>
+            <w:rFonts w:ascii="Arial" w:hAnsi="Arial" w:cs="Arial"/>
+            <w:b/>
+            <w:bCs/>
+            <w:color w:val="auto"/>
+            <w:sz w:val="18"/>
+            <w:szCs w:val="18"/>
+            <w:lang w:val="ru-RU"/>
+          </w:rPr>
+          <w:t>Репрессированные в СССР</w:t>
+        </w:r>
+      </w:hyperlink>
     </w:p>
     <w:p>
       <w:pPr>
@@ -958,38 +2720,6 @@
           <w:lang w:val="ru-RU"/>
         </w:rPr>
       </w:pPr>
-      <w:hyperlink r:id="rId4" w:history="1">
-        <w:r>
-          <w:rPr>
-            <w:rStyle w:val="Hyperlink"/>
-            <w:b/>
-            <w:bCs/>
-            <w:u w:val="none"/>
-            <w:lang w:val="ru-RU"/>
-          </w:rPr>
-          <w:t xml:space="preserve">Здесь ссылки на </w:t>
-        </w:r>
-        <w:r>
-          <w:rPr>
-            <w:rStyle w:val="Hyperlink"/>
-            <w:b/>
-            <w:bCs/>
-            <w:u w:val="none"/>
-            <w:lang w:val="ru-RU"/>
-          </w:rPr>
-          <w:t>основные</w:t>
-        </w:r>
-        <w:r>
-          <w:rPr>
-            <w:rStyle w:val="Hyperlink"/>
-            <w:b/>
-            <w:bCs/>
-            <w:u w:val="none"/>
-            <w:lang w:val="ru-RU"/>
-          </w:rPr>
-          <w:t xml:space="preserve"> источники</w:t>
-        </w:r>
-      </w:hyperlink>
     </w:p>
     <w:p>
       <w:pPr>
@@ -1004,39 +2734,6 @@
     </w:p>
     <w:p>
       <w:pPr>
-        <w:pStyle w:val="Body"/>
-        <w:shd w:val="clear" w:color="auto" w:fill="FFFFFF"/>
-        <w:spacing w:after="0" w:line="240" w:lineRule="auto"/>
-        <w:jc w:val="center"/>
-        <w:rPr>
-          <w:rFonts w:ascii="Arial" w:hAnsi="Arial" w:cs="Arial"/>
-          <w:b/>
-          <w:bCs/>
-          <w:color w:val="auto"/>
-          <w:kern w:val="0"/>
-          <w:sz w:val="18"/>
-          <w:szCs w:val="18"/>
-          <w:u w:color="1D2228"/>
-          <w:lang w:val="ru-RU"/>
-        </w:rPr>
-      </w:pPr>
-      <w:r>
-        <w:rPr>
-          <w:rFonts w:ascii="Arial" w:hAnsi="Arial" w:cs="Arial"/>
-          <w:b/>
-          <w:bCs/>
-          <w:color w:val="auto"/>
-          <w:kern w:val="0"/>
-          <w:sz w:val="18"/>
-          <w:szCs w:val="18"/>
-          <w:u w:color="1D2228"/>
-          <w:lang w:val="ru-RU"/>
-        </w:rPr>
-        <w:t>СТАТИСТИКА РАССТРЕЛОВ ПО НАЦИОНАЛЬНОСТЯМ</w:t>
-      </w:r>
-    </w:p>
-    <w:p>
-      <w:pPr>
         <w:pBdr>
           <w:bottom w:val="single" w:sz="6" w:space="1" w:color="auto"/>
         </w:pBdr>
@@ -1045,11 +2742,51 @@
           <w:lang w:val="ru-RU"/>
         </w:rPr>
       </w:pPr>
+    </w:p>
+    <w:p>
+      <w:pPr>
+        <w:pBdr>
+          <w:bottom w:val="single" w:sz="6" w:space="1" w:color="auto"/>
+        </w:pBdr>
+        <w:spacing w:after="0" w:line="240" w:lineRule="auto"/>
+        <w:rPr>
+          <w:lang w:val="ru-RU"/>
+        </w:rPr>
+      </w:pPr>
+      <w:r>
+        <w:rPr>
+          <w:b/>
+          <w:bCs/>
+          <w:lang w:val="ru-RU"/>
+        </w:rPr>
+        <w:t>СТАТИСТИКА РАССТРЕЛОВ ПО НАЦИОНАЛЬНОСТЯМ</w:t>
+      </w:r>
+    </w:p>
+    <w:p>
+      <w:pPr>
+        <w:pBdr>
+          <w:bottom w:val="single" w:sz="6" w:space="1" w:color="auto"/>
+        </w:pBdr>
+        <w:spacing w:after="0" w:line="240" w:lineRule="auto"/>
+        <w:rPr>
+          <w:lang w:val="ru-RU"/>
+        </w:rPr>
+      </w:pPr>
+    </w:p>
+    <w:p>
+      <w:pPr>
+        <w:pBdr>
+          <w:bottom w:val="single" w:sz="6" w:space="1" w:color="auto"/>
+        </w:pBdr>
+        <w:spacing w:after="0" w:line="240" w:lineRule="auto"/>
+        <w:rPr>
+          <w:lang w:val="ru-RU"/>
+        </w:rPr>
+      </w:pPr>
       <w:r>
         <w:rPr>
           <w:noProof/>
         </w:rPr>
-        <w:lastRenderedPageBreak/>
         <w:drawing>
           <wp:inline distT="0" distB="0" distL="0" distR="0" wp14:anchorId="6EA9CC9F" wp14:editId="2C3E421A">
             <wp:extent cx="5943600" cy="4969510"/>
@@ -1066,10 +2803,10 @@
                     <pic:cNvPicPr/>
                   </pic:nvPicPr>
                   <pic:blipFill>
-                    <a:blip r:embed="rId5">
+                    <a:blip r:embed="rId34">
                       <a:extLst>
                         <a:ext uri="{96DAC541-7B7A-43D3-8B79-37D633B846F1}">
-                          <asvg:svgBlip xmlns:asvg="http://schemas.microsoft.com/office/drawing/2016/SVG/main" r:embed="rId6"/>
+                          <asvg:svgBlip xmlns:asvg="http://schemas.microsoft.com/office/drawing/2016/SVG/main" r:embed="rId35"/>
                         </a:ext>
                       </a:extLst>
                     </a:blip>
@@ -1244,7 +2981,6 @@
           <w:sz w:val="18"/>
           <w:szCs w:val="18"/>
         </w:rPr>
-        <w:lastRenderedPageBreak/>
         <w:drawing>
           <wp:inline distT="0" distB="0" distL="0" distR="0" wp14:anchorId="77E94F31" wp14:editId="31E4AD7C">
             <wp:extent cx="5943600" cy="4658454"/>
@@ -1263,7 +2999,7 @@
                     </pic:cNvPicPr>
                   </pic:nvPicPr>
                   <pic:blipFill>
-                    <a:blip r:embed="rId7">
+                    <a:blip r:embed="rId36">
                       <a:extLst>
                         <a:ext uri="{28A0092B-C50C-407E-A947-70E740481C1C}">
                           <a14:useLocalDpi xmlns:a14="http://schemas.microsoft.com/office/drawing/2010/main" val="0"/>
@@ -1913,7 +3649,6 @@
   <w:style w:type="character" w:default="1" w:styleId="DefaultParagraphFont">
     <w:name w:val="Default Paragraph Font"/>
     <w:uiPriority w:val="1"/>
-    <w:semiHidden/>
     <w:unhideWhenUsed/>
   </w:style>
   <w:style w:type="table" w:default="1" w:styleId="TableNormal">

</xml_diff>